<commit_message>
Updated PPT and Report
</commit_message>
<xml_diff>
--- a/Nighttime_Pothole_Detection_Combined_Project_Report_Updated.docx
+++ b/Nighttime_Pothole_Detection_Combined_Project_Report_Updated.docx
@@ -578,7 +578,287 @@
         <w:pStyle w:val="Heading3"/>
       </w:pPr>
       <w:r>
-        <w:t>2.1.1 Dataset Split and Counts</w:t>
+        <w:t>2.1.</w:t>
+      </w:r>
+      <w:r>
+        <w:t>1 Process of generating synthetic nighttime images from daylight images</w:t>
+      </w:r>
+    </w:p>
+    <w:p>
+      <w:pPr>
+        <w:pStyle w:val="ListBullet"/>
+        <w:tabs>
+          <w:tab w:val="clear" w:pos="360"/>
+          <w:tab w:val="num" w:pos="720"/>
+        </w:tabs>
+        <w:ind w:left="720"/>
+        <w:rPr>
+          <w:lang w:val="en-IN"/>
+        </w:rPr>
+      </w:pPr>
+      <w:r>
+        <w:rPr>
+          <w:b/>
+          <w:bCs/>
+          <w:lang w:val="en-IN"/>
+        </w:rPr>
+        <w:t>Linear light</w:t>
+      </w:r>
+      <w:r>
+        <w:rPr>
+          <w:b/>
+          <w:bCs/>
+          <w:lang w:val="en-IN"/>
+        </w:rPr>
+        <w:t>:</w:t>
+      </w:r>
+      <w:r>
+        <w:rPr>
+          <w:lang w:val="en-IN"/>
+        </w:rPr>
+        <w:t xml:space="preserve"> Convert pixel values to linear light (gamma 2.2) so the brightness maths behaves like physical light.</w:t>
+      </w:r>
+    </w:p>
+    <w:p>
+      <w:pPr>
+        <w:pStyle w:val="ListBullet"/>
+        <w:tabs>
+          <w:tab w:val="clear" w:pos="360"/>
+          <w:tab w:val="num" w:pos="720"/>
+        </w:tabs>
+        <w:ind w:left="720"/>
+        <w:rPr>
+          <w:lang w:val="en-IN"/>
+        </w:rPr>
+      </w:pPr>
+      <w:r>
+        <w:rPr>
+          <w:b/>
+          <w:bCs/>
+          <w:lang w:val="en-IN"/>
+        </w:rPr>
+        <w:t>Remove the daylight</w:t>
+      </w:r>
+      <w:r>
+        <w:rPr>
+          <w:b/>
+          <w:bCs/>
+          <w:lang w:val="en-IN"/>
+        </w:rPr>
+        <w:t xml:space="preserve">: </w:t>
+      </w:r>
+      <w:r>
+        <w:rPr>
+          <w:lang w:val="en-IN"/>
+        </w:rPr>
+        <w:t>Estimate the large-scale lighting with a heavy blur</w:t>
+      </w:r>
+      <w:r>
+        <w:rPr>
+          <w:lang w:val="en-IN"/>
+        </w:rPr>
+        <w:t xml:space="preserve"> </w:t>
+      </w:r>
+      <w:r>
+        <w:rPr>
+          <w:lang w:val="en-IN"/>
+        </w:rPr>
+        <w:t>and divide most of it out (strength 0.85). Sun patches and tree shadows flatten, while surface colour and local detail such as potholes stay.</w:t>
+      </w:r>
+    </w:p>
+    <w:p>
+      <w:pPr>
+        <w:pStyle w:val="ListBullet"/>
+        <w:tabs>
+          <w:tab w:val="clear" w:pos="360"/>
+          <w:tab w:val="num" w:pos="720"/>
+        </w:tabs>
+        <w:ind w:left="720"/>
+        <w:rPr>
+          <w:lang w:val="en-IN"/>
+        </w:rPr>
+      </w:pPr>
+      <w:r>
+        <w:rPr>
+          <w:b/>
+          <w:bCs/>
+          <w:lang w:val="en-IN"/>
+        </w:rPr>
+        <w:t>Add night lighting</w:t>
+      </w:r>
+      <w:r>
+        <w:rPr>
+          <w:b/>
+          <w:bCs/>
+          <w:lang w:val="en-IN"/>
+        </w:rPr>
+        <w:t>:</w:t>
+      </w:r>
+      <w:r>
+        <w:rPr>
+          <w:lang w:val="en-IN"/>
+        </w:rPr>
+        <w:t xml:space="preserve"> A warm headlight cone, strongest at the bottom centre and fading outward, plus a dim bluish ambient floor</w:t>
+      </w:r>
+      <w:r>
+        <w:rPr>
+          <w:lang w:val="en-IN"/>
+        </w:rPr>
+        <w:t xml:space="preserve"> was added for overall night illumination</w:t>
+      </w:r>
+      <w:r>
+        <w:rPr>
+          <w:lang w:val="en-IN"/>
+        </w:rPr>
+        <w:t>.</w:t>
+      </w:r>
+    </w:p>
+    <w:p>
+      <w:pPr>
+        <w:pStyle w:val="ListBullet"/>
+        <w:tabs>
+          <w:tab w:val="clear" w:pos="360"/>
+          <w:tab w:val="num" w:pos="720"/>
+        </w:tabs>
+        <w:ind w:left="720"/>
+        <w:rPr>
+          <w:lang w:val="en-IN"/>
+        </w:rPr>
+      </w:pPr>
+      <w:r>
+        <w:rPr>
+          <w:b/>
+          <w:bCs/>
+          <w:lang w:val="en-IN"/>
+        </w:rPr>
+        <w:t>Auto-exposure</w:t>
+      </w:r>
+      <w:r>
+        <w:rPr>
+          <w:b/>
+          <w:bCs/>
+          <w:lang w:val="en-IN"/>
+        </w:rPr>
+        <w:t xml:space="preserve">: </w:t>
+      </w:r>
+      <w:r>
+        <w:rPr>
+          <w:lang w:val="en-IN"/>
+        </w:rPr>
+        <w:t>Binary s</w:t>
+      </w:r>
+      <w:r>
+        <w:rPr>
+          <w:lang w:val="en-IN"/>
+        </w:rPr>
+        <w:t xml:space="preserve">earch </w:t>
+      </w:r>
+      <w:r>
+        <w:rPr>
+          <w:lang w:val="en-IN"/>
+        </w:rPr>
+        <w:t>done on a range to find</w:t>
+      </w:r>
+      <w:r>
+        <w:rPr>
+          <w:lang w:val="en-IN"/>
+        </w:rPr>
+        <w:t xml:space="preserve"> gain that makes the image’s mean brightness land on a target (0–255 scale). The target is capped at 70% of the original image’s brightness, so the output is always darker than its source, whatever the source brightness.</w:t>
+      </w:r>
+    </w:p>
+    <w:p>
+      <w:pPr>
+        <w:pStyle w:val="ListBullet"/>
+        <w:tabs>
+          <w:tab w:val="clear" w:pos="360"/>
+          <w:tab w:val="num" w:pos="720"/>
+        </w:tabs>
+        <w:ind w:left="720"/>
+        <w:rPr>
+          <w:lang w:val="en-IN"/>
+        </w:rPr>
+      </w:pPr>
+      <w:r>
+        <w:rPr>
+          <w:b/>
+          <w:bCs/>
+          <w:lang w:val="en-IN"/>
+        </w:rPr>
+        <w:t>Camera noise</w:t>
+      </w:r>
+      <w:r>
+        <w:rPr>
+          <w:b/>
+          <w:bCs/>
+          <w:lang w:val="en-IN"/>
+        </w:rPr>
+        <w:t>:</w:t>
+      </w:r>
+      <w:r>
+        <w:rPr>
+          <w:lang w:val="en-IN"/>
+        </w:rPr>
+        <w:t xml:space="preserve"> Poisson (shot) noise </w:t>
+      </w:r>
+      <w:r>
+        <w:rPr>
+          <w:lang w:val="en-IN"/>
+        </w:rPr>
+        <w:t>and</w:t>
+      </w:r>
+      <w:r>
+        <w:rPr>
+          <w:lang w:val="en-IN"/>
+        </w:rPr>
+        <w:t xml:space="preserve"> Gaussian (read) noise, as on a high-ISO sensor.</w:t>
+      </w:r>
+    </w:p>
+    <w:p>
+      <w:pPr>
+        <w:pStyle w:val="ListBullet"/>
+        <w:tabs>
+          <w:tab w:val="clear" w:pos="360"/>
+          <w:tab w:val="num" w:pos="720"/>
+        </w:tabs>
+        <w:ind w:left="720"/>
+        <w:rPr>
+          <w:lang w:val="en-IN"/>
+        </w:rPr>
+      </w:pPr>
+      <w:r>
+        <w:rPr>
+          <w:b/>
+          <w:bCs/>
+          <w:lang w:val="en-IN"/>
+        </w:rPr>
+        <w:t>Finish</w:t>
+      </w:r>
+      <w:r>
+        <w:rPr>
+          <w:b/>
+          <w:bCs/>
+          <w:lang w:val="en-IN"/>
+        </w:rPr>
+        <w:t>:</w:t>
+      </w:r>
+      <w:r>
+        <w:rPr>
+          <w:lang w:val="en-IN"/>
+        </w:rPr>
+        <w:t xml:space="preserve"> Convert back to sRGB and desaturate by 30%, because colour fades in low light.</w:t>
+      </w:r>
+    </w:p>
+    <w:p/>
+    <w:p>
+      <w:pPr>
+        <w:pStyle w:val="Heading3"/>
+      </w:pPr>
+      <w:r>
+        <w:lastRenderedPageBreak/>
+        <w:t>2.1.2</w:t>
+      </w:r>
+      <w:r>
+        <w:t xml:space="preserve"> Dataset Split and Counts</w:t>
       </w:r>
     </w:p>
     <w:tbl>
@@ -915,7 +1195,6 @@
         <w:pStyle w:val="ListBullet"/>
       </w:pPr>
       <w:r>
-        <w:lastRenderedPageBreak/>
         <w:t>PyTorch: 2.11.0+cu130.</w:t>
       </w:r>
     </w:p>
@@ -2010,7 +2289,6 @@
               <w:rPr>
                 <w:sz w:val="18"/>
               </w:rPr>
-              <w:lastRenderedPageBreak/>
               <w:t>Configured epochs</w:t>
             </w:r>
           </w:p>
@@ -2536,6 +2814,7 @@
         <w:pStyle w:val="Heading1"/>
       </w:pPr>
       <w:r>
+        <w:lastRenderedPageBreak/>
         <w:t>3. Results and Discussion</w:t>
       </w:r>
     </w:p>
@@ -2862,7 +3141,6 @@
         <w:pStyle w:val="Heading2"/>
       </w:pPr>
       <w:r>
-        <w:lastRenderedPageBreak/>
         <w:t>3.2 YOLOv8s (Small) Results</w:t>
       </w:r>
     </w:p>
@@ -4456,7 +4734,6 @@
         <w:pStyle w:val="Heading2"/>
       </w:pPr>
       <w:r>
-        <w:lastRenderedPageBreak/>
         <w:t>3.5 Results on the Real-Night Dataset</w:t>
       </w:r>
     </w:p>
@@ -5512,6 +5789,7 @@
         <w:pStyle w:val="Heading2"/>
       </w:pPr>
       <w:r>
+        <w:lastRenderedPageBreak/>
         <w:t>3.7 Qualitative Results</w:t>
       </w:r>
     </w:p>
@@ -5527,11 +5805,7 @@
     </w:p>
     <w:p>
       <w:r>
-        <w:t xml:space="preserve">The most important additional finding is the synthetic-to-real transfer gap. The YOLO11m model's custom-evaluator mAP@0.5 falls from 58.88% on synthetic test to 16.79% on real-night images. Its mAP@0.5:0.95 falls from 29.30% to 6.50%, </w:t>
-      </w:r>
-      <w:r>
-        <w:lastRenderedPageBreak/>
-        <w:t>while F1 at confidence 0.30 falls from 59.03% to 24.20%. The fine-tuned model still substantially outperforms the original COCO baseline, but it misses many real-night potholes and generates many false positives.</w:t>
+        <w:t>The most important additional finding is the synthetic-to-real transfer gap. The YOLO11m model's custom-evaluator mAP@0.5 falls from 58.88% on synthetic test to 16.79% on real-night images. Its mAP@0.5:0.95 falls from 29.30% to 6.50%, while F1 at confidence 0.30 falls from 59.03% to 24.20%. The fine-tuned model still substantially outperforms the original COCO baseline, but it misses many real-night potholes and generates many false positives.</w:t>
       </w:r>
     </w:p>
     <w:p>
@@ -5621,7 +5895,11 @@
     </w:p>
     <w:p>
       <w:r>
-        <w:t>The project prepared a pothole-only synthetic-night dataset containing 2,679 images and 7,270 pothole instances, then evaluated YOLOv8n, YOLOv8s, and YOLO11m-based detection pipelines. On the synthetic test split, YOLOv8s achieved 59.98% mAP@0.5 and 30.43% mAP@0.5:0.95, while YOLO11m achieved 60.72% and 31.05% using Ultralytics val(). The additional YOLO11m evaluation on 1,330 filtered real-night images showed that fine-tuning on synthetic-night data improves performance substantially over the original COCO-pretrained model, but real-night performance remains limited: mAP@0.5 is 16.79%, mAP@0.5:0.95 is 6.50%, and F1 at confidence 0.30 is 24.20%. The combined findings demonstrate that synthetic nighttime augmentation can support pothole detector training, but synthetic-to-real domain differences remain a major limitation.</w:t>
+        <w:t xml:space="preserve">The project prepared a pothole-only synthetic-night dataset containing 2,679 images and 7,270 pothole instances, then evaluated YOLOv8n, YOLOv8s, and YOLO11m-based detection pipelines. On the synthetic test split, YOLOv8s achieved 59.98% mAP@0.5 and 30.43% mAP@0.5:0.95, while YOLO11m achieved 60.72% and 31.05% using Ultralytics val(). The additional YOLO11m evaluation on 1,330 filtered real-night images showed that fine-tuning on synthetic-night data </w:t>
+      </w:r>
+      <w:r>
+        <w:lastRenderedPageBreak/>
+        <w:t>improves performance substantially over the original COCO-pretrained model, but real-night performance remains limited: mAP@0.5 is 16.79%, mAP@0.5:0.95 is 6.50%, and F1 at confidence 0.30 is 24.20%. The combined findings demonstrate that synthetic nighttime augmentation can support pothole detector training, but synthetic-to-real domain differences remain a major limitation.</w:t>
       </w:r>
     </w:p>
     <w:p>
@@ -5639,11 +5917,7 @@
     </w:p>
     <w:p>
       <w:r>
-        <w:t xml:space="preserve">The teammate's YOLO11m notebook reports the best checkpoint at /kaggle/working/runs/yolo11m_synthetic_ft/weights/best.pt and last.pt in the same weights folder. It also saves results_comparison.csv, results_recall_by_size.csv, results_summary.json, evaluation plots, training curves, qualitative </w:t>
-      </w:r>
-      <w:r>
-        <w:lastRenderedPageBreak/>
-        <w:t>figures, and report_outputs.zip under /kaggle/working. These are Kaggle runtime paths and may not persist after a session reset unless saved as notebook outputs or copied to persistent storage.</w:t>
+        <w:t>The teammate's YOLO11m notebook reports the best checkpoint at /kaggle/working/runs/yolo11m_synthetic_ft/weights/best.pt and last.pt in the same weights folder. It also saves results_comparison.csv, results_recall_by_size.csv, results_summary.json, evaluation plots, training curves, qualitative figures, and report_outputs.zip under /kaggle/working. These are Kaggle runtime paths and may not persist after a session reset unless saved as notebook outputs or copied to persistent storage.</w:t>
       </w:r>
     </w:p>
     <w:p>
@@ -5929,7 +6203,7 @@
   <w:abstractNum w:abstractNumId="8" w15:restartNumberingAfterBreak="0">
     <w:nsid w:val="FFFFFF89"/>
     <w:multiLevelType w:val="singleLevel"/>
-    <w:tmpl w:val="29761A62"/>
+    <w:tmpl w:val="6A12A50C"/>
     <w:lvl w:ilvl="0">
       <w:start w:val="1"/>
       <w:numFmt w:val="bullet"/>

</xml_diff>